<commit_message>
Se añadio soporte para el nivel de degradación y la temperatura interna.
</commit_message>
<xml_diff>
--- a/V1 Node Health Analyzer.docx
+++ b/V1 Node Health Analyzer.docx
@@ -36,398 +36,208 @@
       </w:r>
     </w:p>
     <w:p>
-      <w:r>
-        <w:rPr>
-          <w:rFonts w:ascii="Segoe UI Emoji" w:hAnsi="Segoe UI Emoji" w:cs="Segoe UI Emoji"/>
-        </w:rPr>
-        <w:t>✅</w:t>
-      </w:r>
-      <w:r>
+      <w:pPr>
+        <w:rPr>
+          <w:strike/>
+        </w:rPr>
+      </w:pPr>
+      <w:r>
+        <w:rPr>
+          <w:strike/>
+        </w:rPr>
         <w:t xml:space="preserve"> Importar carpeta CSV</w:t>
       </w:r>
       <w:r>
+        <w:rPr>
+          <w:strike/>
+        </w:rPr>
         <w:br/>
-      </w:r>
-      <w:r>
-        <w:rPr>
-          <w:rFonts w:ascii="Segoe UI Emoji" w:hAnsi="Segoe UI Emoji" w:cs="Segoe UI Emoji"/>
-        </w:rPr>
-        <w:t>✅</w:t>
-      </w:r>
-      <w:r>
         <w:t xml:space="preserve"> SQLite</w:t>
       </w:r>
       <w:r>
+        <w:rPr>
+          <w:strike/>
+        </w:rPr>
         <w:br/>
-      </w:r>
-      <w:r>
-        <w:rPr>
-          <w:rFonts w:ascii="Segoe UI Emoji" w:hAnsi="Segoe UI Emoji" w:cs="Segoe UI Emoji"/>
-        </w:rPr>
-        <w:t>✅</w:t>
-      </w:r>
-      <w:r>
         <w:t xml:space="preserve"> Tabla principal</w:t>
       </w:r>
       <w:r>
+        <w:rPr>
+          <w:strike/>
+        </w:rPr>
         <w:br/>
-      </w:r>
-      <w:r>
-        <w:rPr>
-          <w:rFonts w:ascii="Segoe UI Emoji" w:hAnsi="Segoe UI Emoji" w:cs="Segoe UI Emoji"/>
-        </w:rPr>
-        <w:t>✅</w:t>
-      </w:r>
-      <w:r>
         <w:t xml:space="preserve"> Health Score</w:t>
       </w:r>
       <w:r>
+        <w:rPr>
+          <w:strike/>
+        </w:rPr>
         <w:br/>
-      </w:r>
-      <w:r>
-        <w:rPr>
-          <w:rFonts w:ascii="Segoe UI Emoji" w:hAnsi="Segoe UI Emoji" w:cs="Segoe UI Emoji"/>
-        </w:rPr>
-        <w:t>✅</w:t>
-      </w:r>
-      <w:r>
         <w:t xml:space="preserve"> Clasificaci</w:t>
       </w:r>
       <w:r>
         <w:rPr>
           <w:rFonts w:ascii="Calibri" w:hAnsi="Calibri" w:cs="Calibri"/>
+          <w:strike/>
         </w:rPr>
         <w:t>ó</w:t>
       </w:r>
       <w:r>
+        <w:rPr>
+          <w:strike/>
+        </w:rPr>
         <w:t>n autom</w:t>
       </w:r>
       <w:r>
         <w:rPr>
           <w:rFonts w:ascii="Calibri" w:hAnsi="Calibri" w:cs="Calibri"/>
+          <w:strike/>
         </w:rPr>
         <w:t>á</w:t>
       </w:r>
       <w:r>
+        <w:rPr>
+          <w:strike/>
+        </w:rPr>
         <w:t>tica</w:t>
       </w:r>
       <w:r>
+        <w:rPr>
+          <w:strike/>
+        </w:rPr>
         <w:br/>
-      </w:r>
-      <w:r>
-        <w:rPr>
-          <w:rFonts w:ascii="Segoe UI Emoji" w:hAnsi="Segoe UI Emoji" w:cs="Segoe UI Emoji"/>
-        </w:rPr>
-        <w:t>✅</w:t>
-      </w:r>
-      <w:r>
         <w:t xml:space="preserve"> Colores por clasificaci</w:t>
       </w:r>
       <w:r>
         <w:rPr>
           <w:rFonts w:ascii="Calibri" w:hAnsi="Calibri" w:cs="Calibri"/>
+          <w:strike/>
         </w:rPr>
         <w:t>ó</w:t>
       </w:r>
       <w:r>
+        <w:rPr>
+          <w:strike/>
+        </w:rPr>
         <w:t>n</w:t>
       </w:r>
       <w:r>
+        <w:rPr>
+          <w:strike/>
+        </w:rPr>
         <w:br/>
-      </w:r>
-      <w:r>
-        <w:rPr>
-          <w:rFonts w:ascii="Segoe UI Emoji" w:hAnsi="Segoe UI Emoji" w:cs="Segoe UI Emoji"/>
-        </w:rPr>
-        <w:t>✅</w:t>
-      </w:r>
-      <w:r>
         <w:t xml:space="preserve"> Ventana detalle</w:t>
       </w:r>
       <w:r>
+        <w:rPr>
+          <w:strike/>
+        </w:rPr>
         <w:br/>
-      </w:r>
-      <w:r>
-        <w:rPr>
-          <w:rFonts w:ascii="Segoe UI Emoji" w:hAnsi="Segoe UI Emoji" w:cs="Segoe UI Emoji"/>
-        </w:rPr>
-        <w:t>✅</w:t>
-      </w:r>
-      <w:r>
         <w:t xml:space="preserve"> Gr</w:t>
       </w:r>
       <w:r>
         <w:rPr>
           <w:rFonts w:ascii="Calibri" w:hAnsi="Calibri" w:cs="Calibri"/>
+          <w:strike/>
         </w:rPr>
         <w:t>á</w:t>
       </w:r>
       <w:r>
+        <w:rPr>
+          <w:strike/>
+        </w:rPr>
         <w:t>fica de voltaje</w:t>
       </w:r>
       <w:r>
+        <w:rPr>
+          <w:strike/>
+        </w:rPr>
         <w:br/>
-      </w:r>
-      <w:r>
-        <w:rPr>
-          <w:rFonts w:ascii="Segoe UI Emoji" w:hAnsi="Segoe UI Emoji" w:cs="Segoe UI Emoji"/>
-        </w:rPr>
-        <w:t>✅</w:t>
-      </w:r>
-      <w:r>
         <w:t xml:space="preserve"> Filtro por fechas</w:t>
       </w:r>
       <w:r>
+        <w:rPr>
+          <w:strike/>
+        </w:rPr>
         <w:br/>
-      </w:r>
-      <w:r>
-        <w:rPr>
-          <w:rFonts w:ascii="Segoe UI Emoji" w:hAnsi="Segoe UI Emoji" w:cs="Segoe UI Emoji"/>
-        </w:rPr>
-        <w:t>✅</w:t>
-      </w:r>
-      <w:r>
         <w:t xml:space="preserve"> Filtro por tipo de adquisici</w:t>
       </w:r>
       <w:r>
         <w:rPr>
           <w:rFonts w:ascii="Calibri" w:hAnsi="Calibri" w:cs="Calibri"/>
+          <w:strike/>
         </w:rPr>
         <w:t>ó</w:t>
       </w:r>
       <w:r>
+        <w:rPr>
+          <w:strike/>
+        </w:rPr>
         <w:t>n</w:t>
       </w:r>
       <w:r>
+        <w:rPr>
+          <w:strike/>
+        </w:rPr>
         <w:br/>
-      </w:r>
-      <w:r>
-        <w:rPr>
-          <w:rFonts w:ascii="Segoe UI Emoji" w:hAnsi="Segoe UI Emoji" w:cs="Segoe UI Emoji"/>
-        </w:rPr>
-        <w:t>✅</w:t>
-      </w:r>
-      <w:r>
         <w:t xml:space="preserve"> Resumen de salud</w:t>
       </w:r>
       <w:r>
+        <w:rPr>
+          <w:strike/>
+        </w:rPr>
         <w:br/>
-      </w:r>
-      <w:r>
-        <w:rPr>
-          <w:rFonts w:ascii="Segoe UI Emoji" w:hAnsi="Segoe UI Emoji" w:cs="Segoe UI Emoji"/>
-        </w:rPr>
-        <w:t>✅</w:t>
-      </w:r>
-      <w:r>
         <w:t xml:space="preserve"> </w:t>
       </w:r>
       <w:proofErr w:type="spellStart"/>
       <w:r>
+        <w:rPr>
+          <w:strike/>
+        </w:rPr>
         <w:t>Dashboard</w:t>
       </w:r>
       <w:proofErr w:type="spellEnd"/>
       <w:r>
+        <w:rPr>
+          <w:strike/>
+        </w:rPr>
         <w:t xml:space="preserve"> b</w:t>
       </w:r>
       <w:r>
         <w:rPr>
           <w:rFonts w:ascii="Calibri" w:hAnsi="Calibri" w:cs="Calibri"/>
+          <w:strike/>
         </w:rPr>
         <w:t>á</w:t>
       </w:r>
       <w:r>
+        <w:rPr>
+          <w:strike/>
+        </w:rPr>
         <w:t>sico</w:t>
       </w:r>
       <w:r>
+        <w:rPr>
+          <w:strike/>
+        </w:rPr>
         <w:br/>
-      </w:r>
-      <w:r>
-        <w:rPr>
-          <w:rFonts w:ascii="Segoe UI Emoji" w:hAnsi="Segoe UI Emoji" w:cs="Segoe UI Emoji"/>
-        </w:rPr>
-        <w:t>✅</w:t>
-      </w:r>
-      <w:r>
         <w:t xml:space="preserve"> Doble </w:t>
       </w:r>
       <w:proofErr w:type="spellStart"/>
       <w:r>
+        <w:rPr>
+          <w:strike/>
+        </w:rPr>
         <w:t>click</w:t>
       </w:r>
       <w:proofErr w:type="spellEnd"/>
       <w:r>
+        <w:rPr>
+          <w:strike/>
+        </w:rPr>
         <w:t xml:space="preserve"> sobre nodo</w:t>
       </w:r>
     </w:p>
-    <w:p>
-      <w:r>
-        <w:pict w14:anchorId="012BFBF6">
-          <v:rect id="_x0000_i1031" style="width:0;height:1.5pt" o:hralign="center" o:hrstd="t" o:hr="t" fillcolor="#a0a0a0" stroked="f"/>
-        </w:pict>
-      </w:r>
-    </w:p>
-    <w:p>
-      <w:pPr>
-        <w:rPr>
-          <w:b/>
-          <w:bCs/>
-        </w:rPr>
-      </w:pPr>
-      <w:r>
-        <w:rPr>
-          <w:b/>
-          <w:bCs/>
-        </w:rPr>
-        <w:t>Lo que falta para cerrar V1</w:t>
-      </w:r>
-    </w:p>
-    <w:p>
-      <w:pPr>
-        <w:rPr>
-          <w:b/>
-          <w:bCs/>
-        </w:rPr>
-      </w:pPr>
-      <w:r>
-        <w:rPr>
-          <w:b/>
-          <w:bCs/>
-        </w:rPr>
-        <w:t>Sprint 2.3</w:t>
-      </w:r>
-    </w:p>
-    <w:p>
-      <w:r>
-        <w:rPr>
-          <w:rFonts w:ascii="Segoe UI Emoji" w:hAnsi="Segoe UI Emoji" w:cs="Segoe UI Emoji"/>
-        </w:rPr>
-        <w:t>🔲</w:t>
-      </w:r>
-      <w:r>
-        <w:t xml:space="preserve"> Buscar nodo</w:t>
-      </w:r>
-    </w:p>
-    <w:p>
-      <w:pPr>
-        <w:rPr>
-          <w:b/>
-          <w:bCs/>
-        </w:rPr>
-      </w:pPr>
-      <w:r>
-        <w:rPr>
-          <w:b/>
-          <w:bCs/>
-        </w:rPr>
-        <w:t>Sprint 2.4</w:t>
-      </w:r>
-    </w:p>
-    <w:p>
-      <w:r>
-        <w:rPr>
-          <w:rFonts w:ascii="Segoe UI Emoji" w:hAnsi="Segoe UI Emoji" w:cs="Segoe UI Emoji"/>
-        </w:rPr>
-        <w:t>🔲</w:t>
-      </w:r>
-      <w:r>
-        <w:t xml:space="preserve"> Exportar Excel</w:t>
-      </w:r>
-    </w:p>
-    <w:p>
-      <w:pPr>
-        <w:rPr>
-          <w:b/>
-          <w:bCs/>
-        </w:rPr>
-      </w:pPr>
-      <w:r>
-        <w:rPr>
-          <w:b/>
-          <w:bCs/>
-        </w:rPr>
-        <w:t>Sprint 2.5</w:t>
-      </w:r>
-    </w:p>
-    <w:p>
-      <w:r>
-        <w:rPr>
-          <w:rFonts w:ascii="Segoe UI Emoji" w:hAnsi="Segoe UI Emoji" w:cs="Segoe UI Emoji"/>
-        </w:rPr>
-        <w:t>🔲</w:t>
-      </w:r>
-      <w:r>
-        <w:t xml:space="preserve"> Exportar PDF</w:t>
-      </w:r>
-    </w:p>
-    <w:p>
-      <w:pPr>
-        <w:rPr>
-          <w:b/>
-          <w:bCs/>
-        </w:rPr>
-      </w:pPr>
-      <w:r>
-        <w:rPr>
-          <w:b/>
-          <w:bCs/>
-        </w:rPr>
-        <w:t>Sprint 3</w:t>
-      </w:r>
-    </w:p>
-    <w:p>
-      <w:r>
-        <w:rPr>
-          <w:rFonts w:ascii="Segoe UI Emoji" w:hAnsi="Segoe UI Emoji" w:cs="Segoe UI Emoji"/>
-        </w:rPr>
-        <w:t>🔲</w:t>
-      </w:r>
-      <w:r>
-        <w:t xml:space="preserve"> KPI </w:t>
-      </w:r>
-      <w:proofErr w:type="spellStart"/>
-      <w:r>
-        <w:t>Dashboard</w:t>
-      </w:r>
-      <w:proofErr w:type="spellEnd"/>
-      <w:r>
-        <w:t xml:space="preserve"> completo</w:t>
-      </w:r>
-    </w:p>
-    <w:p>
-      <w:r>
-        <w:rPr>
-          <w:rFonts w:ascii="Segoe UI Emoji" w:hAnsi="Segoe UI Emoji" w:cs="Segoe UI Emoji"/>
-        </w:rPr>
-        <w:t>🔲</w:t>
-      </w:r>
-      <w:r>
-        <w:t xml:space="preserve"> Gráfica de carga (%)</w:t>
-      </w:r>
-    </w:p>
-    <w:p>
-      <w:r>
-        <w:rPr>
-          <w:rFonts w:ascii="Segoe UI Emoji" w:hAnsi="Segoe UI Emoji" w:cs="Segoe UI Emoji"/>
-        </w:rPr>
-        <w:t>🔲</w:t>
-      </w:r>
-      <w:r>
-        <w:t xml:space="preserve"> Gráfica GPS (%)</w:t>
-      </w:r>
-    </w:p>
-    <w:p>
-      <w:r>
-        <w:rPr>
-          <w:rFonts w:ascii="Segoe UI Emoji" w:hAnsi="Segoe UI Emoji" w:cs="Segoe UI Emoji"/>
-        </w:rPr>
-        <w:t>🔲</w:t>
-      </w:r>
-      <w:r>
-        <w:t xml:space="preserve"> Gráfica temperatura (°C)</w:t>
-      </w:r>
-    </w:p>
-    <w:p/>
     <w:sectPr>
       <w:pgSz w:w="12240" w:h="15840"/>
       <w:pgMar w:top="1417" w:right="1701" w:bottom="1417" w:left="1701" w:header="708" w:footer="708" w:gutter="0"/>
@@ -1041,6 +851,7 @@
   <w:style w:type="character" w:default="1" w:styleId="Fuentedeprrafopredeter">
     <w:name w:val="Default Paragraph Font"/>
     <w:uiPriority w:val="1"/>
+    <w:semiHidden/>
     <w:unhideWhenUsed/>
   </w:style>
   <w:style w:type="table" w:default="1" w:styleId="Tablanormal">

</xml_diff>